<commit_message>
Test unitarios realizados por la IA y nademas se agregaron funciones de ploteo para mapas de perfil en 3D.
</commit_message>
<xml_diff>
--- a/ploteo/pruebas/INFORME_TESTS_MARCHA_BLANCA.docx
+++ b/ploteo/pruebas/INFORME_TESTS_MARCHA_BLANCA.docx
@@ -1976,7 +1976,7 @@
           <w:rFonts w:ascii="Consolas" w:hAnsi="Consolas"/>
           <w:sz w:val="19"/>
         </w:rPr>
-        <w:t>python -m unittest discover -s fuentes/pruebas -v</w:t>
+        <w:t>python -m pytest fuentes/pruebas -v</w:t>
       </w:r>
     </w:p>
     <w:p>
@@ -1985,7 +1985,7 @@
           <w:rFonts w:ascii="Consolas" w:hAnsi="Consolas"/>
           <w:sz w:val="19"/>
         </w:rPr>
-        <w:t># solo un módulo:</w:t>
+        <w:t># solo un archivo:</w:t>
       </w:r>
     </w:p>
     <w:p>
@@ -1994,7 +1994,16 @@
           <w:rFonts w:ascii="Consolas" w:hAnsi="Consolas"/>
           <w:sz w:val="19"/>
         </w:rPr>
-        <w:t>python -m unittest discover -s fuentes/pruebas -p 'test_capturar.py' -v</w:t>
+        <w:t>python -m pytest fuentes/pruebas/test_capturar.py -v</w:t>
+      </w:r>
+    </w:p>
+    <w:p>
+      <w:r>
+        <w:rPr>
+          <w:b/>
+          <w:sz w:val="20"/>
+        </w:rPr>
+        <w:t>NOTA: La marcha blanca del instalador ejecuta los suites con pytest, que corre tanto tests unittest (como estos) como tests en estilo pytest puro que se agreguen a la carpeta pruebas/.</w:t>
       </w:r>
     </w:p>
     <w:p>

</xml_diff>